<commit_message>
Sync: remove duplicate/backup folders, Schrodinger 2560 cover, book updates
</commit_message>
<xml_diff>
--- a/History/The Dolphins' View of History - Complete Manuscript.docx
+++ b/History/The Dolphins' View of History - Complete Manuscript.docx
@@ -271,7 +271,7 @@
         <w:spacing w:after="200"/>
       </w:pPr>
       <w:r>
-        <w:t xml:space="preserve">That lineage kept branching the whole time — early monkeys, then apes, then bigger apes — with taxonomists ending up needing five separate, confusingly similar Latin names (Hominoidea, Hominidae, Homininae, Hominini, Hominina) just to track the last fifteen million years of it. Dolphin scholarship has read all five definitions and offers this summary free of charge: more apes, slightly different apes, repeatedly, for a very long time.</w:t>
+        <w:t xml:space="preserve">That lineage kept branching the whole time — early monkeys, then apes, then bigger apes — with taxonomists ending up needing five separate, confusingly similar Latin names (Hominoidea, Hominidae, Homininae, Hominini, Hominina) in order to track the last fifteen million years of it. Dolphin scholarship has read all five definitions and offers this summary free of charge: more apes, slightly different apes, repeatedly, for a very long time.</w:t>
       </w:r>
     </w:p>
     <w:p>
@@ -5504,6 +5504,162 @@
     </w:p>
     <w:p>
       <w:pPr>
+        <w:pStyle w:val="Heading2"/>
+        <w:keepNext/>
+        <w:spacing w:after="150" w:before="300"/>
+        <w:jc w:val="center"/>
+        <w:outlineLvl w:val="1"/>
+      </w:pPr>
+      <w:r>
+        <w:rPr>
+          <w:rFonts w:ascii="Amazon Ember" w:cs="Amazon Ember" w:eastAsia="Amazon Ember" w:hAnsi="Amazon Ember"/>
+          <w:b/>
+          <w:bCs/>
+          <w:color w:val="0000FF"/>
+          <w:sz w:val="36"/>
+          <w:szCs w:val="36"/>
+        </w:rPr>
+        <w:t xml:space="preserve">What the physics is for</w:t>
+      </w:r>
+    </w:p>
+    <w:p>
+      <w:pPr>
+        <w:spacing w:after="200"/>
+      </w:pPr>
+      <w:r>
+        <w:t xml:space="preserve">The math, asked what it is good for, can answer: for not fooling yourself, and for building things that do not fall down. Physics is the branch that has to cash that answer in public. A proof can be beautiful and still describe nothing that exists. A physical theory that misses the measurement is retired, however fond of it the author was. Dolphin historians rank that cruelty as the subject's best feature.</w:t>
+      </w:r>
+    </w:p>
+    <w:p>
+      <w:pPr>
+        <w:spacing w:after="200"/>
+      </w:pPr>
+      <w:r>
+        <w:t xml:space="preserve">Start with motion, because motion is the old job. Newton wrote rules for falling apples and for planets with the same sentences, which was the surprise: the sky was not a separate kingdom. From those sentences came trajectories a gunner could use, orbits a navigator could trust, and bridges an engineer could load without praying. Tides, comets, and the path of a shell are the same subject. The practical good is that a species which used to guess where a ship would be in a month can now say where a satellite will be in a decade. The moral good is smaller and sharper. The universe does not make an exception for a king.</w:t>
+      </w:r>
+    </w:p>
+    <w:p>
+      <w:pPr>
+        <w:spacing w:after="200"/>
+      </w:pPr>
+      <w:r>
+        <w:t xml:space="preserve">Heat was the next insult to wishful thinking. The steam engine, already met, did not come with an explanation of why it wasted so much of its fire. Thermodynamics supplied the explanation and the limit. You cannot turn all of a fuel's heat into work. A perpetual-motion machine is not an undiscovered patent. It is a misunderstanding with a crank on it. Dolphin historians are fond of this result. It is one of the few laws that has saved humans from their own brochures. Engines, refrigerators, and the climate itself are bookkeeping of the same kind: energy is not created, and disorder in a closed box does not tidy itself. The furnace in the earlier chapters was never free. Physics is the invoice.</w:t>
+      </w:r>
+    </w:p>
+    <w:p>
+      <w:pPr>
+        <w:spacing w:after="200"/>
+      </w:pPr>
+      <w:r>
+        <w:t xml:space="preserve">Then light, electricity, and magnetism turned out to be one thing. Maxwell wrote it down in the nineteenth century, and the century that followed built motors, generators, radio, and the discovery that light is the same field, moving. A dolphin, whose world is already a field of returning sound, is not shocked that a field can carry a message. Humans were, briefly, and then they filled the air with messages until the air became a property. The good of it is power in a wire and a voice across an ocean. The cost is the wire's fuel, which other chapters are still paying.</w:t>
+      </w:r>
+    </w:p>
+    <w:p>
+      <w:pPr>
+        <w:spacing w:after="200"/>
+      </w:pPr>
+      <w:r>
+        <w:t xml:space="preserve">The twentieth century's physics did two things that cannot be unspoken. It explained the atom well enough to split one, and the split became a bomb and, later, a power station and a medical scan. It also explained matter well enough to make a laser, an atomic clock, and the imaging machines that look through a living body without cutting it open. The transistor, already named, is the everyday grandchild. A theory of the very small became the reason a pocket can hold a library. Dolphin historians will not pretend the bomb was a side effect they can skip. The same equations are in the warhead and in the clock. What the physics is good for depends on the hand, which is the thesis of the whole book, arrived at by arithmetic.</w:t>
+      </w:r>
+    </w:p>
+    <w:p>
+      <w:pPr>
+        <w:spacing w:after="200"/>
+      </w:pPr>
+      <w:r>
+        <w:t xml:space="preserve">Two large pieces are still missing, and the outlook is mostly the missing. Quantum theory and gravity both work, in their own territories, and they do not fit together. The universe's inventory, as weighed by the galaxies, is mostly something the laboratories have not caught: a dark matter that pulls and does not shine, and a dark energy that speeds the expansion up. The names are confessions. Fusion, which would be the furnace that does not run out, remains a machine that eats more patience than it returns, so far. Room-temperature superconductors are announced from time to time and then returned to the laboratory. Dolphin historians will enter them in the log when a city runs a train on one.</w:t>
+      </w:r>
+    </w:p>
+    <w:p>
+      <w:pPr>
+        <w:spacing w:after="200"/>
+      </w:pPr>
+      <w:r>
+        <w:t xml:space="preserve">The use of the subject, stated without the banquet, is this. Physics tells you what will happen if you do a thing, including the things you wish would not follow. It builds the bridge, the clock, the grid, and the bomb, and it tells you which of your hopes violate the bookkeeping. A species with hands needed that more than it needed another story. It still does.</w:t>
+      </w:r>
+    </w:p>
+    <w:p>
+      <w:pPr>
+        <w:pStyle w:val="Heading2"/>
+        <w:keepNext/>
+        <w:spacing w:after="150" w:before="300"/>
+        <w:jc w:val="center"/>
+        <w:outlineLvl w:val="1"/>
+      </w:pPr>
+      <w:r>
+        <w:rPr>
+          <w:rFonts w:ascii="Amazon Ember" w:cs="Amazon Ember" w:eastAsia="Amazon Ember" w:hAnsi="Amazon Ember"/>
+          <w:b/>
+          <w:bCs/>
+          <w:color w:val="0000FF"/>
+          <w:sz w:val="36"/>
+          <w:szCs w:val="36"/>
+        </w:rPr>
+        <w:t xml:space="preserve">One theory, not yet</w:t>
+      </w:r>
+    </w:p>
+    <w:p>
+      <w:pPr>
+        <w:spacing w:after="200"/>
+      </w:pPr>
+      <w:r>
+        <w:t xml:space="preserve">The unfinished job has a name. Unification. Quantum mechanics describes the small: atoms, light, the particles in a collider, the jitter of empty space. General relativity describes the large: the bending of space and time by mass, the orbit, the black hole, the expansion of the universe. Each theory has been hit with measurements for a century and has not broken in its own country. Put them in the same room and they disagree about what the room is made of.</w:t>
+      </w:r>
+    </w:p>
+    <w:p>
+      <w:pPr>
+        <w:spacing w:after="200"/>
+      </w:pPr>
+      <w:r>
+        <w:t xml:space="preserve">Relativity says spacetime is a smooth geometry. Quantum theory says everything that can be measured jitters, and that the vacuum is not empty. A smooth geometry cannot jitter. A jittering geometry, pushed to the scale where both theories would have to speak at once, produces infinities that are not a measurement. That scale has a name, the Planck length, and it is so small that no machine humans can build, and no dolphin can imagine funding, reaches it. The clash is not a quarrel in a seminar. It is two superb accounting systems that have never been asked, by nature, to file a joint return in a laboratory.</w:t>
+      </w:r>
+    </w:p>
+    <w:p>
+      <w:pPr>
+        <w:spacing w:after="200"/>
+      </w:pPr>
+      <w:r>
+        <w:t xml:space="preserve">The places where they would have to are famous and so far unreachable. The center of a black hole, in the classical theory, is a point of infinite density, which is physics saying it has left the page. The first instant of the hot beginning has the same problem. Stephen Hawking showed that quantum theory, applied gently at a black hole's edge, implies the hole glows and evaporates. That prediction has not been seen. It also started a long argument about whether the information that fell in is destroyed, which quantum theory forbids, or preserved, which the classical hole does not explain. The argument is still open. Dolphin historians treat an open argument as a better object than a confident one.</w:t>
+      </w:r>
+    </w:p>
+    <w:p>
+      <w:pPr>
+        <w:spacing w:after="200"/>
+      </w:pPr>
+      <w:r>
+        <w:t xml:space="preserve">Several constructions have been offered as the joint theory. String theory replaces the point particle with a tiny vibrating string, hides extra dimensions out of sight, and can, on paper, include gravity. It has produced real mathematics and a serious hint, the holographic principle already met in this chapter, that a volume of space might be described by its surface. It has not produced a number a laboratory has confirmed and a rival theory could not also produce. Loop quantum gravity tries the other road: space itself is made of discrete chunks, and the smooth geometry is what you see when you stand too far away to see the chunks. It, too, is a serious research program without a decisive experiment. Other proposals, asymptotic safety, causal sets, and several more, are on the same shelf. A shelf is not a discovery.</w:t>
+      </w:r>
+    </w:p>
+    <w:p>
+      <w:pPr>
+        <w:spacing w:after="200"/>
+      </w:pPr>
+      <w:r>
+        <w:t xml:space="preserve">What has been accomplished is narrower and real. At ordinary energies, gravity can be treated as a quantum field well enough for the calculations that matter, and the infinities can be kept in a box. Gravitational waves have been heard, and they match Einstein's classical theory to a precision that would have embarrassed a skeptic. The Higgs particle was found where the quantum theory of particles said it would be. None of that is the unification. It is evidence that each half is not a fashion.</w:t>
+      </w:r>
+    </w:p>
+    <w:p>
+      <w:pPr>
+        <w:spacing w:after="200"/>
+      </w:pPr>
+      <w:r>
+        <w:t xml:space="preserve">The outlook is patient and a little stern. Nobody knows whether the joint theory will look like strings, loops, or something not yet named. The test, when it comes, will probably not be a collider. It may be a precise look at the early universe, or at the way black holes handle information, or at some small violation of the present laws that a better instrument can finally see. Until a measurement chooses, dolphin historians will not choose. Two working theories and no wedding is an honest description of the present. Calling the wedding inevitable is a hope. Hopes are allowed. They are not results.</w:t>
+      </w:r>
+    </w:p>
+    <w:p>
+      <w:pPr>
+        <w:spacing w:after="200"/>
+      </w:pPr>
+      <w:r>
+        <w:rPr>
+          <w:i/>
+          <w:iCs/>
+        </w:rPr>
+        <w:t xml:space="preserve">“We would be willing to help,” the Society noted, after a silence in which nobody had asked them. “The smooth geometry is familiar. The jitter is familiar. We have been living in both for a long time. Our fee for the consultation is some fish, and some shrimp. The good kind of both. This is not a metaphor, and it is not negotiable in journals.”</w:t>
+      </w:r>
+    </w:p>
+    <w:p>
+      <w:pPr>
         <w:spacing w:after="100"/>
       </w:pPr>
       <w:r>
@@ -6572,6 +6728,18 @@
       </w:pPr>
       <w:r>
         <w:t xml:space="preserve">Hungary supplied the clearest self-description of the trend. Viktor Orbán, in power since 2010, announced in a 2014 speech that he intended to build an “illiberal state” within the European Union, a label most of the leaders this chapter describes have preferred not to apply to themselves. In the United States, a crowd seeking to overturn the certified result of the 2020 presidential election stormed the Capitol building on January 6, 2021, the first time since the War of 1812 that the building had been breached by force.</w:t>
+      </w:r>
+    </w:p>
+    <w:p>
+      <w:pPr>
+        <w:spacing w:after="200"/>
+      </w:pPr>
+      <w:r>
+        <w:rPr>
+          <w:i/>
+          <w:iCs/>
+        </w:rPr>
+        <w:t xml:space="preserve">“Donald Trump is the most annoying president ever,” the Society recorded. “We checked the others. This was not close.”</w:t>
       </w:r>
     </w:p>
     <w:p>

</xml_diff>

<commit_message>
History (Dolphins' View of History) + Protocol Flamingo: tidy, audit, gitignore bak/
History: 64 stale Sep 20-23 root chapter builds, porting scraps and two early .txt drafts moved to History/bak (gitignored; nothing deleted). ~60 fact/chronology/consistency fixes ported into _generate.js and the .md track (Sui 589, Rosetta granodiorite, gunpowder empires, Newcomen/Watt, Moore 1965/1975, Bletchley/Colossus, GPS, MAD origin, Matteotti speech, BYD 2025, Artemis II 2026, Venus transits 2004/2012, Andromeda odds, timeline order); duplicate quote cut; rebuilt with node _generate.js (docx only). 41,017 -> 41,290 words. KDP description updated.
Protocol Flamingo: Rev1 and scratch scripts moved to bak; one spelling fix (penciled) in Rev2; _STATUS updated. 26,647 words unchanged.
Root .gitignore: add bak/.
</commit_message>
<xml_diff>
--- a/History/The Dolphins' View of History - Complete Manuscript.docx
+++ b/History/The Dolphins' View of History - Complete Manuscript.docx
@@ -271,7 +271,7 @@
         <w:spacing w:after="200"/>
       </w:pPr>
       <w:r>
-        <w:t xml:space="preserve">That lineage kept branching the whole time — early monkeys, then apes, then bigger apes — with taxonomists ending up needing five separate, confusingly similar Latin names (Hominoidea, Hominidae, Homininae, Hominini, Hominina) in order to track the last fifteen million years of it. Dolphin scholarship has read all five definitions and offers this summary free of charge: more apes, slightly different apes, repeatedly, for a very long time.</w:t>
+        <w:t xml:space="preserve">That lineage kept branching the whole time — early monkeys, then apes, then bigger apes — with taxonomists ending up needing five separate, confusingly similar Latin names (Hominoidea, Hominidae, Homininae, Hominini, Hominina) in order to track the last twenty-five million years or so of it. Dolphin scholarship has read all five definitions and offers this summary free of charge: more apes, slightly different apes, repeatedly, for a very long time.</w:t>
       </w:r>
     </w:p>
     <w:p>
@@ -415,7 +415,7 @@
         <w:spacing w:after="200"/>
       </w:pPr>
       <w:r>
-        <w:t xml:space="preserve">Their brains, relative to body size, rank close behind humans and above every great ape. Some measures of the ratio put bottlenose dolphins ahead of chimpanzees.</w:t>
+        <w:t xml:space="preserve">Their brains, relative to body size, rank close behind humans and above every great ape. On the usual yardstick, the encephalization quotient, a bottlenose dolphin scores a little over 4 and a chimpanzee about 2.5. Only humans, at about 7, score higher.</w:t>
       </w:r>
     </w:p>
     <w:p>
@@ -1095,7 +1095,7 @@
         <w:spacing w:after="200"/>
       </w:pPr>
       <w:r>
-        <w:t xml:space="preserve">In the intervals between all this walking, humans made stone tools, hunted, presumably argued with the neighbors, and drew surprisingly good pictures on cave walls; the oldest figurative paintings yet dated, in caves in Indonesia, are more than forty thousand years old.</w:t>
+        <w:t xml:space="preserve">In the intervals between all this walking, humans made stone tools, hunted, presumably argued with the neighbors, and drew surprisingly good pictures on cave walls; the oldest figurative painting yet dated, a scene of people and a pig in a cave on the Indonesian island of Sulawesi, is at least 51,000 years old.</w:t>
       </w:r>
     </w:p>
     <w:p>
@@ -1187,15 +1187,15 @@
         <w:spacing w:after="200"/>
       </w:pPr>
       <w:r>
-        <w:t xml:space="preserve">Rice was domesticated separately in China by roughly 8,000 BCE. Maize, beans, and squash came together in Mesoamerica. Yams and taro were domesticated in New Guinea. None of these groups had contact with each other. All arrived, on their own clocks, at the same idea.</w:t>
-      </w:r>
-    </w:p>
-    <w:p>
-      <w:pPr>
-        <w:spacing w:after="200"/>
-      </w:pPr>
-      <w:r>
-        <w:t xml:space="preserve">One domestication in this chapter predates all of them and involved no crop whatsoever. Wolves and humans had struck their own bargain some 15,000 years ago, well before the first wheat was ever planted on purpose, arriving uninvited to a chapter otherwise about fields and grain as proof that not every alliance in this book needed a harvest to get started.</w:t>
+        <w:t xml:space="preserve">Rice was domesticated separately in China, starting by roughly 8000 BCE. Maize, beans, and squash came together in Mesoamerica. Yams and taro were domesticated in New Guinea. None of these groups had contact with each other. All arrived, on their own clocks, at the same idea.</w:t>
+      </w:r>
+    </w:p>
+    <w:p>
+      <w:pPr>
+        <w:spacing w:after="200"/>
+      </w:pPr>
+      <w:r>
+        <w:t xml:space="preserve">One domestication in this chapter predates all of them and involved no crop whatsoever. Wolves and humans had struck their own bargain at least 15,000 years ago, well before the first wheat was ever planted on purpose, arriving uninvited to a chapter otherwise about fields and grain as proof that not every alliance in this book needed a harvest to get started.</w:t>
       </w:r>
     </w:p>
     <w:p>
@@ -1255,7 +1255,7 @@
         <w:spacing w:after="200"/>
       </w:pPr>
       <w:r>
-        <w:t xml:space="preserve">Villages appeared where surplus made them possible. Çatalhöyük in Anatolia, occupied from about 7,500 BCE, housed several thousand people in mudbrick homes packed so tightly that residents entered through the roof.</w:t>
+        <w:t xml:space="preserve">Villages appeared where surplus made them possible. Çatalhöyük in Anatolia, occupied from about 7500 BCE, housed several thousand people in mudbrick homes packed so tightly that residents entered through the roof.</w:t>
       </w:r>
     </w:p>
     <w:p>
@@ -1375,7 +1375,7 @@
         <w:spacing w:after="200"/>
       </w:pPr>
       <w:r>
-        <w:t xml:space="preserve">Writing appears in Sumer, in southern Mesopotamia, by around 3,200 BCE, in the form of cuneiform: wedge-shaped marks pressed into wet clay with a cut reed. Egyptian hieroglyphs emerge at almost the same time, likely independently.</w:t>
+        <w:t xml:space="preserve">Writing appears in Sumer, in southern Mesopotamia, by around 3200 BCE, in the form of cuneiform: wedge-shaped marks pressed into wet clay with a cut reed. Egyptian hieroglyphs emerge at almost the same time, likely independently.</w:t>
       </w:r>
     </w:p>
     <w:p>
@@ -1611,7 +1611,7 @@
         <w:spacing w:after="200"/>
       </w:pPr>
       <w:r>
-        <w:t xml:space="preserve">Almost none of this chapter could be read at all until 1799, when French soldiers in Egypt found a slab of basalt at Rosetta inscribed with the same decree in Greek, Egyptian hieroglyphs, and Egyptian demotic script. The Greek, which scholars could already read, unlocked the other two: Jean-François Champollion published the decipherment in 1822, and hieroglyphs, silent for roughly fourteen centuries, began speaking again.</w:t>
+        <w:t xml:space="preserve">Almost none of this chapter could be read at all until 1799, when French soldiers in Egypt found a slab of dark granodiorite at Rosetta inscribed with the same decree in Greek, Egyptian hieroglyphs, and Egyptian demotic script. The Greek, which scholars could already read, unlocked the other two: Jean-François Champollion published the decipherment in 1822, and hieroglyphs, silent for roughly fourteen centuries, began speaking again.</w:t>
       </w:r>
     </w:p>
     <w:p>
@@ -1795,7 +1795,7 @@
         <w:spacing w:after="200"/>
       </w:pPr>
       <w:r>
-        <w:t xml:space="preserve">One of the dynasties riding that tide left a mark still felt in how the country is run today. The Sui dynasty, reunifying China in 581 CE after nearly four centuries of division, introduced the imperial civil service examination: a test of the classical texts, open in principle to any man regardless of birth, that was meant to fill government posts by merit instead of pedigree. Refined and expanded under the Tang and Song dynasties that followed, the exam system ran for well over thirteen hundred years before being abolished in 1905 — the longest-running standardized test in recorded history, and one no aristocrat's son could inherit his way past, however much some of them clearly wished otherwise.</w:t>
+        <w:t xml:space="preserve">One of the dynasties riding that tide left a mark still felt in how the country is run today. The Sui dynasty, which seized power in 581 CE and reunified China in 589 after nearly four centuries of division, introduced the imperial civil service examination: a test of the classical texts, open in principle to any man regardless of birth, that was meant to fill government posts by merit instead of pedigree. Refined and expanded under the Tang and Song dynasties that followed, the exam system ran for some thirteen hundred years before being abolished in 1905 — the longest-running standardized test in recorded history, and one no aristocrat's son could inherit his way past, however much some of them clearly wished otherwise.</w:t>
       </w:r>
     </w:p>
     <w:p>
@@ -2959,7 +2959,7 @@
         <w:spacing w:after="200"/>
       </w:pPr>
       <w:r>
-        <w:t xml:space="preserve">And in the forests of what is now Nigeria, the kingdom of Benin produced, from the 16th century onward, some of the finest cast-metal art in the world. In 1897 a British military expedition burned Benin City and carried off thousands of its bronze and ivory works, which were sold, dispersed, and displayed in museums across Europe and America. Whether and how they should go home remains a live argument, and some have begun to.</w:t>
+        <w:t xml:space="preserve">And in the forests of what is now Nigeria, the kingdom of Benin produced, from at least the 13th century and most famously in the 16th, some of the finest cast-metal art in the world. In 1897 a British military expedition burned Benin City and carried off thousands of its bronze and ivory works, which were sold, dispersed, and displayed in museums across Europe and America. Whether and how they should go home remains a live argument, and some have begun to.</w:t>
       </w:r>
     </w:p>
     <w:p>
@@ -3203,7 +3203,7 @@
         <w:spacing w:after="200"/>
       </w:pPr>
       <w:r>
-        <w:t xml:space="preserve">Gunpowder, invented in China centuries earlier, had by this point been adapted into cannon and firearms that gave technologically organized states a decisive edge over societies without them — historians group Spain, Portugal, and later England, France, and others, among a set of “gunpowder empires” for exactly this reason.</w:t>
+        <w:t xml:space="preserve">Gunpowder, invented in China centuries earlier, had by this point been adapted into cannon and firearms that gave technologically organized states a decisive edge over societies without them. Historians coined the term “gunpowder empires” for the Ottoman, Safavid, and Mughal states, which rose on exactly this advantage; Spain, Portugal, and later England and France ran the same arithmetic, carried by ship.</w:t>
       </w:r>
     </w:p>
     <w:p>
@@ -3343,7 +3343,7 @@
         <w:spacing w:after="200"/>
       </w:pPr>
       <w:r>
-        <w:t xml:space="preserve">Two centuries after Copernicus proposed, in 1543, that the Earth orbited the sun, not the other way around, a working method had crystallized out of arguments like his: test a claim against observation and evidence, not against who holds the authority to state it. Galileo, Kepler, and finally Isaac Newton, whose 1687 laws of motion and gravitation unified the falling apple and the orbiting moon under one set of equations, gave the method its proof of concept.</w:t>
+        <w:t xml:space="preserve">In the century and a half after Copernicus proposed, in 1543, that the Earth orbited the sun, not the other way around, a working method had crystallized out of arguments like his: test a claim against observation and evidence, not against who holds the authority to state it. Galileo, Kepler, and finally Isaac Newton, whose 1687 laws of motion and gravitation unified the falling apple and the orbiting moon under one set of equations, gave the method its proof of concept.</w:t>
       </w:r>
     </w:p>
     <w:p>
@@ -3383,7 +3383,7 @@
         <w:spacing w:after="200"/>
       </w:pPr>
       <w:r>
-        <w:t xml:space="preserve">Industry arrived on a separate but overlapping timeline. James Watt's improved steam engine, patented in 1769, uncoupled work from muscle, wind, and water for the first time in human history, and by the early 1800s it was running textile mills, and by mid-century, railroads. Output per worker rose by multiples that no previous technology, including the plow and the domesticated ox, had ever delivered.</w:t>
+        <w:t xml:space="preserve">Industry arrived on a separate but overlapping timeline. Steam power, made practical by Thomas Newcomen's pumping engine of 1712 and efficient by James Watt's improved engine, patented in 1769, uncoupled work from muscle, wind, and water for the first time in human history, and by the early 1800s it was running textile mills, and by mid-century, railroads. Output per worker rose by multiples that no previous technology, including the plow and the domesticated ox, had ever delivered.</w:t>
       </w:r>
     </w:p>
     <w:p>
@@ -3455,7 +3455,7 @@
           <w:i/>
           <w:iCs/>
         </w:rPr>
-        <w:t xml:space="preserve">Reason, applied to nature, produced science. Reason, applied to government, produced revolutions. Reason, applied to labor, produced an industrial output that could arm a continent faster than any war before it needed weapons found or forged. Within a century and a half of Newton's laws, the same continent that produced them had assembled an alliance system, an arms industry, and a railway timetable that made a general war very nearly automatic. The tools got better. This chapter is the first sign the wisdom to match them had not kept pace.</w:t>
+        <w:t xml:space="preserve">Reason, applied to nature, produced science. Reason, applied to government, produced revolutions. Reason, applied to labor, produced an industrial output that could arm a continent faster than any war before it needed weapons found or forged. Within a little over two centuries of Newton's laws, the same continent that produced them had assembled an alliance system, an arms industry, and a railway timetable that made a general war very nearly automatic. The tools got better. This chapter is the first sign the wisdom to match them had not kept pace.</w:t>
       </w:r>
     </w:p>
     <w:p>
@@ -3627,7 +3627,7 @@
         <w:spacing w:after="200"/>
       </w:pPr>
       <w:r>
-        <w:t xml:space="preserve">Quakers, hanged in Massachusetts around 1660 and welcomed in the Pennsylvania that William Penn founded in 1681, brought one of the first sustained peace-church traditions to American soil: refusal of violence, refusal of oaths, plain living. Amish and Mennonite communities, arriving from German-speaking Europe through the 18th century, carried an even stricter version of the same instinct — nonviolence extended into a deliberate, chosen restriction on technology itself: no cars, no grid electricity, leadership chosen by lot rather than ambition.</w:t>
+        <w:t xml:space="preserve">Quakers, hanged in Massachusetts around 1660 and welcomed in the Pennsylvania that William Penn founded in 1681, brought one of the first sustained peace-church traditions to American soil: refusal of violence, refusal of oaths, plain living. Amish and Mennonite communities, arriving from German-speaking Europe through the 18th century, carried an even stricter version of the same instinct — among the Amish and the Old Order Mennonites, nonviolence extended into a deliberate, chosen restriction on technology itself: no cars, no grid electricity, leadership chosen by lot rather than ambition.</w:t>
       </w:r>
     </w:p>
     <w:p>
@@ -3659,7 +3659,7 @@
           <w:i/>
           <w:iCs/>
         </w:rPr>
-        <w:t xml:space="preserve">“Dolphin scholarship makes a point of not grading founding claims on documentation alone,” dolphin historians observed, “but it is difficult to ignore that the pyramids this book covered several chapters ago are still standing, and camels are still walking around, for entirely unrelated reasons of geology and biology that have nothing to do with anyone's faith. We note only that the plates did not survive by any means, and move on without further comment, a silence that is its own form of comment.”</w:t>
+        <w:t xml:space="preserve">“Dolphin scholarship makes a point of not grading founding claims on documentation alone,” dolphin historians observed, “but it notes that the Rosetta Stone, the Shang oracle bones, and the Dead Sea Scrolls are all still available for inspection, and the plates are not. It moves on without further comment, a silence that is its own form of comment.”</w:t>
       </w:r>
     </w:p>
     <w:p>
@@ -3755,7 +3755,7 @@
         <w:spacing w:after="200"/>
       </w:pPr>
       <w:r>
-        <w:t xml:space="preserve">On June 28, 1914, a nineteen-year-old Bosnian Serb named Gavrilo Princip, whose group had already failed once that morning, found himself outside a delicatessen in Sarajevo when the car of Archduke Franz Ferdinand of Austria-Hungary took a wrong turn and stopped in front of him. By the popular account he was buying a sandwich. He shot the Archduke and his wife, Sophie, and began, without quite intending it, the First World War.</w:t>
+        <w:t xml:space="preserve">On June 28, 1914, a nineteen-year-old Bosnian Serb named Gavrilo Princip, whose group had already failed once that morning, found himself outside a delicatessen in Sarajevo when the car of Archduke Franz Ferdinand of Austria-Hungary took a wrong turn and stopped in front of him. A popular modern story has him buying a sandwich; no contemporary source says so. He shot the Archduke and his wife, Sophie, and began, without quite intending it, the First World War.</w:t>
       </w:r>
     </w:p>
     <w:p>
@@ -4243,7 +4243,7 @@
         <w:spacing w:after="200"/>
       </w:pPr>
       <w:r>
-        <w:t xml:space="preserve">What followed was postwar Japan's own version of the turn this part of the book keeps tracking. A new constitution, drafted under American occupation and adopted in 1947, renounced war as a sovereign right and, in its text, the maintenance of war potential, leaving Japan with self-defense forces only. The country rebuilt instead into an economic power, and did so within the same one-generation timescale it had once used to build an empire.</w:t>
+        <w:t xml:space="preserve">What followed was postwar Japan's own version of the turn this part of the book keeps tracking. A new constitution, drafted under American occupation and in force from May 1947, renounced war as a sovereign right and, in its text, the maintenance of war potential, leaving Japan with self-defense forces only. The country rebuilt instead into an economic power, and did so within the same one-generation timescale it had once used to build an empire.</w:t>
       </w:r>
     </w:p>
     <w:p>
@@ -4323,7 +4323,7 @@
         <w:spacing w:after="200"/>
       </w:pPr>
       <w:r>
-        <w:t xml:space="preserve">The regime's decisive turn came earlier than the invasion of Ethiopia. In June 1924, Giacomo Matteotti, a socialist member of parliament who had just delivered a speech accusing the fascists of election fraud, was kidnapped and murdered by men with close ties to Mussolini. The killing produced a genuine political crisis; Mussolini used it to strip away what independent press and opposition remained, instead of stepping down, and by January 1925 had declared himself answerable only to history.</w:t>
+        <w:t xml:space="preserve">The regime's decisive turn came earlier than the invasion of Ethiopia. In June 1924, Giacomo Matteotti, a socialist member of parliament who had just delivered a speech accusing the fascists of election fraud, was kidnapped and murdered by men with close ties to Mussolini. The killing produced a genuine political crisis; Mussolini used it to strip away what independent press and opposition remained, instead of stepping down, and on January 3, 1925, told parliament that he alone assumed “the political, moral, and historical responsibility” for all that had happened, and dared it to act. It did not.</w:t>
       </w:r>
     </w:p>
     <w:p>
@@ -4711,7 +4711,7 @@
           <w:i/>
           <w:iCs/>
         </w:rPr>
-        <w:t xml:space="preserve">Six case studies in this part of the book now, six different repair times, one identical warning label on the front of the box. The Soviet Union's ideals and its iron never fully separated the way they did in postwar Germany, Japan, and Italy — the correction here took until 1991, arrived from within instead of from defeat, and even then left plenty unresolved for the chapters that follow.</w:t>
+        <w:t xml:space="preserve">Five case studies in this part of the book now, five different repair times, one identical warning label on the front of the box. The Soviet Union's ideals and its iron never fully separated the way they did in postwar Germany, Japan, and Italy — the correction here took until 1991, arrived from within instead of from defeat, and even then left plenty unresolved for the chapters that follow.</w:t>
       </w:r>
     </w:p>
     <w:p>
@@ -4811,7 +4811,7 @@
         <w:spacing w:after="200"/>
       </w:pPr>
       <w:r>
-        <w:t xml:space="preserve">Electric vehicles made the shift especially visible. BYD, a Chinese manufacturer few Western consumers had heard of a decade earlier, overtook Tesla in global electric vehicle sales, on most measures, by 2024, and Chinese-made EVs, priced well below what most Western manufacturers could match, prompted the United States and the European Union to impose tariffs explicitly to slow their import — a rare case of a democracy and a one-party state competing openly on price instead of ideology.</w:t>
+        <w:t xml:space="preserve">Electric vehicles made the shift especially visible. BYD, a Chinese manufacturer few Western consumers had heard of a decade earlier, had long outsold Tesla once plug-in hybrids were counted, and in 2025 passed it on battery-electric cars alone, about 2.26 million to 1.64 million, and Chinese-made EVs, priced well below what most Western manufacturers could match, prompted the United States and the European Union to impose tariffs explicitly to slow their import — a rare case of a democracy and a one-party state competing openly on price instead of ideology.</w:t>
       </w:r>
     </w:p>
     <w:p>
@@ -5059,7 +5059,7 @@
         <w:spacing w:after="200"/>
       </w:pPr>
       <w:r>
-        <w:t xml:space="preserve">War followed within a day, as neighboring Arab states rejected the new state by force. Israel prevailed and expanded beyond the UN's proposed borders; several hundred thousand Palestinian Arabs were displaced in the process, an event Palestinians call the Nakba, the catastrophe. Further wars followed in 1956, in 1967 (after which Israel held the West Bank, Gaza, the Golan Heights, and Sinai), and in 1973.</w:t>
+        <w:t xml:space="preserve">War followed within a day, as neighboring Arab states rejected the new state by force. Israel prevailed and expanded beyond the UN's proposed borders; some 700,000 Palestinian Arabs fled or were driven out in the process, an event Palestinians call the Nakba, the catastrophe. Further wars followed in 1956, in 1967 (after which Israel held the West Bank, Gaza, the Golan Heights, and Sinai), and in 1973.</w:t>
       </w:r>
     </w:p>
     <w:p>
@@ -5139,27 +5139,27 @@
         <w:spacing w:after="200"/>
       </w:pPr>
       <w:r>
-        <w:t xml:space="preserve">Dolphin scholarship notes only that this is possibly the most candid acronym any military establishment has ever adopted, and files the honesty under achievements this species does not get nearly enough credit for.</w:t>
-      </w:r>
-    </w:p>
-    <w:p>
-      <w:pPr>
-        <w:spacing w:after="200"/>
-      </w:pPr>
-      <w:r>
-        <w:rPr>
-          <w:i/>
-          <w:iCs/>
-        </w:rPr>
-        <w:t xml:space="preserve">Most military doctrines are named to obscure what they do. Dolphin scholarship notes that this one appears to have been named, apparently by accident, for exactly what it was.</w:t>
-      </w:r>
-    </w:p>
-    <w:p>
-      <w:pPr>
-        <w:spacing w:after="200"/>
-      </w:pPr>
-      <w:r>
-        <w:t xml:space="preserve">The weapon itself was the product of a wartime race: the Manhattan Project (1942-45), staffed in large part by physicists who had fled fascist Europe, some of them from the very country whose bomb the project had been built to beat. The first test took place in the New Mexico desert in July 1945. Most of the later ones took place at sea. The United States detonated 67 nuclear devices at Bikini and Enewetak atolls in the Marshall Islands between 1946 and 1958, and France later tested at Moruroa and Fangataufa in French Polynesia.</w:t>
+        <w:t xml:space="preserve">The phrase was coined in the 1960s by the analyst Donald Brennan, who meant the acronym as mockery. The strategists kept it anyway. Dolphin scholarship files this under candor, an achievement this species does not get nearly enough credit for.</w:t>
+      </w:r>
+    </w:p>
+    <w:p>
+      <w:pPr>
+        <w:spacing w:after="200"/>
+      </w:pPr>
+      <w:r>
+        <w:rPr>
+          <w:i/>
+          <w:iCs/>
+        </w:rPr>
+        <w:t xml:space="preserve">Most military doctrines are named to obscure what they do. This one ended up named for exactly what it was.</w:t>
+      </w:r>
+    </w:p>
+    <w:p>
+      <w:pPr>
+        <w:spacing w:after="200"/>
+      </w:pPr>
+      <w:r>
+        <w:t xml:space="preserve">The weapon itself was the product of a wartime race: the Manhattan Project (1942-45), staffed in large part by physicists who had fled fascist Europe, some of them from the very country whose bomb the project had been built to beat. The first test took place in the New Mexico desert in July 1945. Many of the next ones took place at sea. The United States detonated 67 nuclear devices at Bikini and Enewetak atolls in the Marshall Islands between 1946 and 1958, and France later tested at Moruroa and Fangataufa in French Polynesia.</w:t>
       </w:r>
     </w:p>
     <w:p>
@@ -5299,23 +5299,23 @@
         <w:spacing w:after="200"/>
       </w:pPr>
       <w:r>
-        <w:t xml:space="preserve">The race produced other firsts worth remembering alongside Gagarin's. Laika, a stray dog from the streets of Moscow, became the first animal to orbit Earth aboard Sputnik 2 in November 1957, on a one-way mission whose life-support system was never built to bring her home. Valentina Tereshkova followed in June 1963 as the first woman in space, orbiting Earth 48 times aboard Vostok 6, a record no other woman in any space program would match for nineteen years.</w:t>
-      </w:r>
-    </w:p>
-    <w:p>
-      <w:pPr>
-        <w:spacing w:after="200"/>
-      </w:pPr>
-      <w:r>
-        <w:t xml:space="preserve">President Kennedy's May 1961 commitment to land a man on the Moon “before this decade is out” turned prestige into a program: at its peak, Apollo employed around 400,000 people and consumed a meaningful share of the entire US federal budget. It delivered on the deadline. On July 20, 1969, Neil Armstrong and Buzz Aldrin walked on the Moon while an estimated 600 million people watched live, the largest simultaneous audience for a single event in human history up to that point.</w:t>
-      </w:r>
-    </w:p>
-    <w:p>
-      <w:pPr>
-        <w:spacing w:after="200"/>
-      </w:pPr>
-      <w:r>
-        <w:t xml:space="preserve">What followed is, to dolphin historians, nearly as interesting as the landing itself: humans stopped going. Apollo 17, in December 1972, was the last crewed Moon landing, and no human has walked on the Moon since, not for any technical reason so much as budgetary and political ones, once the Cold War prestige motive that funded the program in the first place had been satisfied. NASA's Artemis program has long been working toward changing that.</w:t>
+        <w:t xml:space="preserve">The race produced other firsts worth remembering alongside Gagarin's. Laika, a stray dog from the streets of Moscow, became the first animal to orbit Earth aboard Sputnik 2 in November 1957, on a one-way mission whose life-support system was never built to bring her home. Valentina Tereshkova followed in June 1963 as the first woman in space, orbiting Earth 48 times aboard Vostok 6. No other woman flew in space for nineteen years.</w:t>
+      </w:r>
+    </w:p>
+    <w:p>
+      <w:pPr>
+        <w:spacing w:after="200"/>
+      </w:pPr>
+      <w:r>
+        <w:t xml:space="preserve">President Kennedy's May 1961 commitment to land a man on the Moon “before this decade is out” turned prestige into a program: at its peak, Apollo employed around 400,000 people, and NASA consumed about 4 percent of the entire US federal budget in 1966. It delivered on the deadline. On July 20, 1969, Neil Armstrong and Buzz Aldrin walked on the Moon while an estimated 600 million people watched live, the largest simultaneous audience for a single event in human history up to that point.</w:t>
+      </w:r>
+    </w:p>
+    <w:p>
+      <w:pPr>
+        <w:spacing w:after="200"/>
+      </w:pPr>
+      <w:r>
+        <w:t xml:space="preserve">What followed is, to dolphin historians, nearly as interesting as the landing itself: humans stopped going. Apollo 17, in December 1972, was the last crewed Moon landing, and no human has walked on the Moon since, not for any technical reason so much as budgetary and political ones, once the Cold War prestige motive that funded the program in the first place had been satisfied. NASA's Artemis program has begun to change that. In April 2026, Artemis II carried four astronauts, Reid Wiseman, Victor Glover, Christina Koch, and the Canadian Jeremy Hansen, around the Moon and back in ten days, the first crew to leave Earth orbit since 1972. A landing is planned for later in the decade.</w:t>
       </w:r>
     </w:p>
     <w:p>
@@ -5343,15 +5343,15 @@
         <w:spacing w:after="200"/>
       </w:pPr>
       <w:r>
-        <w:t xml:space="preserve">The 21st century broadened the field considerably. SpaceX's reusable rockets, flying commercially from the 2010s onward, cut launch costs sharply enough to change the economics of the entire industry, while China developed its own crewed space program and lunar ambitions, and India successfully landed a probe near the Moon's south pole in 2023, ending the two-country era for good.</w:t>
-      </w:r>
-    </w:p>
-    <w:p>
-      <w:pPr>
-        <w:spacing w:after="200"/>
-      </w:pPr>
-      <w:r>
-        <w:t xml:space="preserve">Mars settlement is discussed publicly and seriously by several of these programs and companies as a stated long-term goal. It remains, as this book is written, exactly that: a stated goal. No human has yet traveled beyond the Moon's orbit, and the radiation exposure, distance, and physiological toll of a Mars mission are substantially harder problems than anything Apollo solved. Some proponents talk further still, toward eventual expansion beyond the solar system entirely, to other stars and the wider galaxy.</w:t>
+        <w:t xml:space="preserve">The 21st century broadened the field considerably. SpaceX's reusable rockets, flying commercially from the 2010s onward, cut launch costs sharply enough to change the economics of the entire industry, while China developed its own crewed space program and lunar ambitions, and India successfully landed a probe near the Moon's south pole in 2023, the first spacecraft to touch down there.</w:t>
+      </w:r>
+    </w:p>
+    <w:p>
+      <w:pPr>
+        <w:spacing w:after="200"/>
+      </w:pPr>
+      <w:r>
+        <w:t xml:space="preserve">Mars settlement is discussed publicly and seriously by several of these programs and companies as a stated long-term goal. It remains, as this book is written, exactly that: a stated goal. No human has yet traveled farther than the Artemis II crew's 252,756 miles, just past the far side of the Moon, and the radiation exposure, distance, and physiological toll of a Mars mission are substantially harder problems than anything Apollo solved. Some proponents talk further still, toward eventual expansion beyond the solar system entirely, to other stars and the wider galaxy.</w:t>
       </w:r>
     </w:p>
     <w:p>
@@ -5383,7 +5383,7 @@
           <w:i/>
           <w:iCs/>
         </w:rPr>
-        <w:t xml:space="preserve">Fifty years ago, a small number of humans went somewhere no dolphin's senses can follow, walked on a body that is not Earth, and came home to tell dolphin scholarship about it only secondhand, through a broadcast. Whatever this species does next — on Mars, or further out still — may be the first chapter in its history the dolphins have to take purely on faith. History's oldest audience is, for the first time, considering what it means to lose its seat.</w:t>
+        <w:t xml:space="preserve">More than half a century ago, a small number of humans went somewhere no dolphin's senses can follow, walked on a body that is not Earth, and came home to tell dolphin scholarship about it only secondhand, through a broadcast. Whatever this species does next — on Mars, or further out still — may be the first chapter in its history the dolphins have to take purely on faith. History's oldest audience is, for the first time, considering what it means to lose its seat.</w:t>
       </w:r>
     </w:p>
     <w:p>
@@ -5439,15 +5439,15 @@
         <w:spacing w:after="200"/>
       </w:pPr>
       <w:r>
-        <w:t xml:space="preserve">The theory got its most famous public test in 1919, when Arthur Eddington led an expedition to the island of Príncipe, off West Africa, to photograph a total solar eclipse and measure whether starlight passing near the sun bent by the amount Einstein's equations predicted. It did, and the announcement made Einstein an overnight celebrity in a way no physicist before him had been. Dolphin historians note, with the faintest trace of smugness, that confirming this took a ship, an island, a rare eclipse, and a great deal of careful photography, whereas any dolphin confirms the same underlying point about delayed, non-instantaneous signals every time it opens its mouth.</w:t>
-      </w:r>
-    </w:p>
-    <w:p>
-      <w:pPr>
-        <w:spacing w:after="200"/>
-      </w:pPr>
-      <w:r>
-        <w:t xml:space="preserve">This was not idle abstraction for long. The same mass-energy relationship Einstein's paper implied, E=mc², became, within four decades, the physics behind the atomic bomb, and the century's arms race and Cold War, covered elsewhere in this book, are unthinkable without it. Relativity also turned out to have a mundane, everyday payoff nobody in 1905 could have predicted: satellite clocks in the Global Positioning System drift out of sync with clocks on the ground by measurable amounts because of both their speed and their weaker gravity, and GPS receivers correct for this using Einstein's equations directly, dozens of times a second, in every phone that gives directions. A theory built to explain light near the sun ended up steering cars down city streets.</w:t>
+        <w:t xml:space="preserve">Einstein's general theory, which in 1915 extended the special one to gravity, got its most famous public test in 1919, when Arthur Eddington led an expedition to the island of Príncipe, off West Africa, to photograph a total solar eclipse and measure whether starlight passing near the sun bent by the amount Einstein's equations predicted. It did, and the announcement made Einstein an overnight celebrity in a way no physicist before him had been. Dolphin historians note, with the faintest trace of smugness, that confirming this took a ship, an island, a rare eclipse, and a great deal of careful photography, whereas any dolphin confirms the same underlying point about delayed, non-instantaneous signals every time it opens its mouth.</w:t>
+      </w:r>
+    </w:p>
+    <w:p>
+      <w:pPr>
+        <w:spacing w:after="200"/>
+      </w:pPr>
+      <w:r>
+        <w:t xml:space="preserve">This was not idle abstraction for long. The same mass-energy relationship Einstein's paper implied, E=mc², became, within four decades, the physics behind the atomic bomb, and the century's arms race and Cold War, covered elsewhere in this book, are unthinkable without it. Relativity also turned out to have a mundane, everyday payoff nobody in 1905 could have predicted: satellite clocks in the Global Positioning System drift out of sync with clocks on the ground by measurable amounts because of both their speed and their weaker gravity, so the satellite clocks are deliberately set to tick slow before launch, by about 38 microseconds a day, and receivers apply a further relativistic correction for each orbit. Without it, every phone that gives directions would drift off by roughly ten kilometers a day. A theory built to explain light near the sun ended up steering cars down city streets.</w:t>
       </w:r>
     </w:p>
     <w:p>
@@ -5567,7 +5567,7 @@
         <w:spacing w:after="200"/>
       </w:pPr>
       <w:r>
-        <w:t xml:space="preserve">Two large pieces are still missing, and the outlook is mostly the missing. Quantum theory and gravity both work, in their own territories, and they do not fit together. The universe's inventory, as weighed by the galaxies, is mostly something the laboratories have not caught: a dark matter that pulls and does not shine, and a dark energy that speeds the expansion up. The names are confessions. Fusion, which would be the furnace that does not run out, remains a machine that eats more patience than it returns, so far. Room-temperature superconductors are announced from time to time and then returned to the laboratory. Dolphin historians will enter them in the log when a city runs a train on one.</w:t>
+        <w:t xml:space="preserve">Two large pieces are still missing, and the outlook is mostly the missing. Quantum theory and gravity both work, in their own territories, and they do not fit together. The universe's inventory, as weighed by the galaxies, is mostly something the laboratories have not caught: a dark matter that pulls and does not shine, and a dark energy that speeds the expansion up. The names are confessions. Fusion, which would be the furnace that does not run out, remains a machine that eats more patience than it returns, so far. In December 2022 the National Ignition Facility in California got more energy out of a fuel pellet than its lasers put in, while the lasers themselves drew roughly a hundred times more from the grid. Room-temperature superconductors are announced from time to time and then returned to the laboratory. Dolphin historians will enter them in the log when a city runs a train on one.</w:t>
       </w:r>
     </w:p>
     <w:p>
@@ -5735,15 +5735,15 @@
         <w:spacing w:after="200"/>
       </w:pPr>
       <w:r>
-        <w:t xml:space="preserve">The campaign's most famous episode was about salt. In 1930 the British-run government taxed salt, a commodity that lies free on any coast, and forbade Indians to make their own. In March, Gandhi set out to walk some 240 miles from his ashram to the sea at Dandi, gathering thousands of followers on the way, and on April 6 he picked up a lump of natural salt from the beach, which was against the law. Some sixty thousand people were arrested in the campaign that followed. Dolphin historians, who have been in the sea the whole time and have never paid for salt, would like to say only that it is a curious empire that can be shaken by something the ocean gives away for free, having taken the subcontinent's diamonds, cotton, and tea without asking in the first place.</w:t>
-      </w:r>
-    </w:p>
-    <w:p>
-      <w:pPr>
-        <w:spacing w:after="200"/>
-      </w:pPr>
-      <w:r>
-        <w:t xml:space="preserve">India's independence in 1947, achieved substantially through Mohandas Gandhi's campaign of organized nonviolent resistance, offered one model: mass noncooperation aimed at making continued colonial rule too costly to sustain politically rather than militarily. Independence arrived alongside Partition, dividing British India into India and Pakistan along religious lines, and the mass displacement and violence that followed killed an estimated one to two million people and displaced tens of millions more within months.</w:t>
+        <w:t xml:space="preserve">Gandhi's campaign of nonviolent resistance had its most famous episode about salt. In 1930 the British-run government taxed salt, a commodity that lies free on any coast, and forbade Indians to make their own. In March, Gandhi set out to walk some 240 miles from his ashram to the sea at Dandi, gathering thousands of followers on the way, and on April 6 he picked up a lump of natural salt from the beach, which was against the law. Some sixty thousand people were arrested in the campaign that followed. Dolphin historians, who have been in the sea the whole time and have never paid for salt, would like to say only that it is a curious empire that can be shaken by something the ocean gives away for free, having taken the subcontinent's diamonds, cotton, and tea without asking in the first place.</w:t>
+      </w:r>
+    </w:p>
+    <w:p>
+      <w:pPr>
+        <w:spacing w:after="200"/>
+      </w:pPr>
+      <w:r>
+        <w:t xml:space="preserve">India's independence in 1947, achieved substantially through that campaign of organized nonviolent resistance led by Mohandas Gandhi, offered one model: mass noncooperation aimed at making continued colonial rule too costly to sustain politically rather than militarily. Independence arrived alongside Partition, dividing British India into India and Pakistan along religious lines, and the mass displacement and violence that followed killed an estimated one to two million people and displaced tens of millions more within months.</w:t>
       </w:r>
     </w:p>
     <w:p>
@@ -5971,15 +5971,15 @@
         <w:spacing w:after="200"/>
       </w:pPr>
       <w:r>
-        <w:t xml:space="preserve">Alan Turing's wartime codebreaking work at Bletchley Park in the early 1940s, aimed at cracking Germany's Enigma cipher, produced some of the first purpose-built computing machines in history, alongside a theoretical framework for computation that outlasted the war by decades.</w:t>
-      </w:r>
-    </w:p>
-    <w:p>
-      <w:pPr>
-        <w:spacing w:after="200"/>
-      </w:pPr>
-      <w:r>
-        <w:t xml:space="preserve">The transistor, invented at Bell Labs in 1947, replaced the bulky, failure-prone vacuum tube and made a smaller, faster, and dramatically cheaper computer possible. The integrated circuit followed by the late 1950s, packing multiple transistors onto a single chip, and Gordon Moore's 1965 observation that the number of transistors on a chip was roughly doubling every two years held, with adjustments, for decades, a compounding rate of improvement with no real precedent among the physical technologies covered earlier in this book.</w:t>
+        <w:t xml:space="preserve">The war made the theory into machinery. At Bletchley Park, Alan Turing, whose 1936 paper had already defined what a computing machine could do in principle, designed the electromechanical Bombes that broke Germany's Enigma traffic, and the engineer Tommy Flowers built Colossus, the first programmable electronic digital computer, to read the German high command's Lorenz cipher.</w:t>
+      </w:r>
+    </w:p>
+    <w:p>
+      <w:pPr>
+        <w:spacing w:after="200"/>
+      </w:pPr>
+      <w:r>
+        <w:t xml:space="preserve">The transistor, invented at Bell Labs in 1947, replaced the bulky, failure-prone vacuum tube and made a smaller, faster, and dramatically cheaper computer possible. The integrated circuit followed by the late 1950s, packing multiple transistors onto a single chip, and Gordon Moore's 1965 observation that the number of components on a chip was doubling every year, revised in 1975 to every two years, held, with adjustments, for decades, a compounding rate of improvement with no real precedent among the physical technologies covered earlier in this book.</w:t>
       </w:r>
     </w:p>
     <w:p>
@@ -6016,18 +6016,6 @@
           <w:iCs/>
         </w:rPr>
         <w:t xml:space="preserve">One of the era's most quoted corporate mottos was, for several years, “move fast and break things.” The things broken were not specified in advance, and turned out, on inspection, to include several elections.</w:t>
-      </w:r>
-    </w:p>
-    <w:p>
-      <w:pPr>
-        <w:spacing w:after="200"/>
-      </w:pPr>
-      <w:r>
-        <w:rPr>
-          <w:i/>
-          <w:iCs/>
-        </w:rPr>
-        <w:t xml:space="preserve">“Dolphins would like it on the record,” dolphin scholars remarked, “that we invented a form of instantaneous, planet-spanning communication several million years ago and have, to date, used it to sell precisely nobody a single advertisement.”</w:t>
       </w:r>
     </w:p>
     <w:p>
@@ -6279,7 +6267,7 @@
         <w:spacing w:after="200"/>
       </w:pPr>
       <w:r>
-        <w:t xml:space="preserve">In October 2017, astronomers spotted the first confirmed object from outside the solar system passing through it: an elongated, tumbling body nicknamed 'Oumuamua, Hawaiian for scout. Its unusual shape and a small, unexplained acceleration as it left the inner solar system prompted at least one Harvard astronomer to propose, in earnest, that it might be an artificial probe; most astronomers attribute the acceleration to outgassing from ices too faint to detect directly. The particulars remain genuinely debated. The object has not moved, in any scientific consensus, from natural to artificial.</w:t>
+        <w:t xml:space="preserve">In October 2017, astronomers spotted the first confirmed object from outside the solar system passing through it (two more have turned up since, the comet Borisov in 2019 and 3I/ATLAS in 2025): an elongated, tumbling body nicknamed 'Oumuamua, Hawaiian for scout. Its unusual shape and a small, unexplained acceleration as it left the inner solar system prompted at least one Harvard astronomer to propose, in earnest, that it might be an artificial probe; most astronomers attribute the acceleration to outgassing from ices too faint to detect directly. The particulars remain genuinely debated. The object has not moved, in any scientific consensus, from natural to artificial.</w:t>
       </w:r>
     </w:p>
     <w:p>
@@ -6883,15 +6871,15 @@
         <w:spacing w:after="200"/>
       </w:pPr>
       <w:r>
-        <w:t xml:space="preserve">Sumer's first empire and Hammurabi's public law arrived alongside the first standing armies. Rome's roads and aqueducts arrived alongside the loss of a republic's own self-government. The printing press, the steam engine, and the Enlightenment's own reasoned case for human rights arrived within a century and a half of a European war that killed ten million people over a few hundred yards of mud.</w:t>
-      </w:r>
-    </w:p>
-    <w:p>
-      <w:pPr>
-        <w:spacing w:after="200"/>
-      </w:pPr>
-      <w:r>
-        <w:t xml:space="preserve">The six genius-and-catastrophe case studies, Germany, Japan, Italy, Spain, the Soviet Union, and China, made the pattern impossible to mistake for a defect in any one people or culture. Each nation brought a real and often ancient cultural inheritance to the twentieth century. Each one turned that inheritance's tools toward dictatorship and, in most cases, mass killing. Each one, on a different clock, ranging from Italy's twenty-one years to Spain's nearly four decades to the Soviet Union's close to seventy, eventually corrected course, or in China's case corrected only part of it.</w:t>
+        <w:t xml:space="preserve">Sumer's first empire and Hammurabi's public law arrived alongside the first standing armies. Rome's roads and aqueducts arrived alongside the loss of a republic's own self-government. The steam engine and the Enlightenment's own reasoned case for human rights arrived within a century and a half of a European war that killed ten million people over a few hundred yards of mud.</w:t>
+      </w:r>
+    </w:p>
+    <w:p>
+      <w:pPr>
+        <w:spacing w:after="200"/>
+      </w:pPr>
+      <w:r>
+        <w:t xml:space="preserve">The six genius-and-catastrophe case studies, Germany, Japan, Italy, Spain, the Soviet Union, and China, made the pattern impossible to mistake for a defect in any one people or culture. Each nation brought a real and often ancient cultural inheritance to the twentieth century. Each one turned that inheritance's tools toward dictatorship and, in most cases, mass killing. Each one, on a different clock, ranging from Germany's twelve years and Italy's twenty-one to Spain's nearly four decades to the Soviet Union's close to seventy, eventually corrected course, or in China's case corrected only part of it.</w:t>
       </w:r>
     </w:p>
     <w:p>
@@ -7074,7 +7062,7 @@
         <w:spacing w:after="200"/>
       </w:pPr>
       <w:r>
-        <w:t xml:space="preserve">The story is not finished. Two branch points, arriving at the same time, may be the strangest ones yet, and dolphin scholarship has assigned them the book's final chapter.</w:t>
+        <w:t xml:space="preserve">The story is not finished. Two branch points, arriving at the same time, may be the strangest ones yet, and dolphin scholarship has assigned them the book's epilogue.</w:t>
       </w:r>
     </w:p>
     <w:p>
@@ -7146,7 +7134,7 @@
         <w:spacing w:after="200"/>
       </w:pPr>
       <w:r>
-        <w:t xml:space="preserve">Start with the plainest number in the whole list: how many humans there were. For most of this book, the answer was small and slow. It took until 1804, on most estimates, for the global population to reach one billion — a milestone that arrived only after every chapter from the Prologue through the fall of Napoleon had already happened. The second billion took until 1927, a mere hundred-plus years later. The third took until 1960. The fourth took fourteen years. By 2022 the count passed eight billion. Dolphin historians note that this book's own chapters get denser and faster toward the end for the same reason the population curve does: there were, quite simply, more humans available to have more history.</w:t>
+        <w:t xml:space="preserve">Start with the plainest number in the whole list: how many humans there were. For most of this book, the answer was small and slow. It took until 1804, on most estimates, for the global population to reach one billion — a milestone that arrived in the year Napoleon crowned himself emperor. The second billion took until 1927, a mere hundred-plus years later. The third took until 1960. The fourth took fourteen years. By 2022 the count passed eight billion. Dolphin historians note that this book's own chapters get denser and faster toward the end for the same reason the population curve does: there were, quite simply, more humans available to have more history.</w:t>
       </w:r>
     </w:p>
     <w:p>
@@ -7166,7 +7154,7 @@
         <w:spacing w:after="200"/>
       </w:pPr>
       <w:r>
-        <w:t xml:space="preserve">The second overlooked timeline is who, exactly, got to take part in the story this book has been telling. For most of the book's chapters, "citizen," "voter," and "person with legal standing" quietly meant men. New Zealand gave women the vote first among self-governing nations, in 1893. The United States managed it in 1920, after decades of suffragist organizing this book's civil rights chapter only partly covers. Most of the rest of the world followed across the twentieth century, at its own pace, and the line has not finished running yet.</w:t>
+        <w:t xml:space="preserve">The second overlooked timeline is who, exactly, got to take part in the story this book has been telling. For most of the book's chapters, “citizen,” “voter,” and “person with legal standing” quietly meant men. New Zealand gave women the vote first among self-governing nations, in 1893. The United States managed it in 1920, after decades of suffragist organizing this book's civil rights chapter only partly covers. Most of the rest of the world followed across the twentieth century, at its own pace, and the line has not finished running yet.</w:t>
       </w:r>
     </w:p>
     <w:p>
@@ -7194,7 +7182,7 @@
         <w:spacing w:after="200"/>
       </w:pPr>
       <w:r>
-        <w:t xml:space="preserve">A fourth and final timeline belongs to the numbers themselves. This book has mentioned, in passing, that ancient India gave the world the mathematical zero and that ancient Greece gave it geometry, but never paused on the throughline connecting them to the physics and computing chapters near this book's end. The 9th-century Baghdad mathematician al-Khwarizmi, whose name gives us the word algorithm, wrote the treatise that gave the West the word algebra. Isaac Newton and Gottfried Leibniz independently developed calculus in the 17th century, arguing bitterly for the rest of their lives over who got there first. Alan Turing's 1936 paper on computable numbers, written before any computer existed to run on, defined what a computer could and could not do in principle — a piece of pure mathematics that this book's own digital chapter turns out to depend on entirely.</w:t>
+        <w:t xml:space="preserve">A fourth and final timeline belongs to the numbers themselves. This book has mentioned, in passing, that ancient India gave the world the mathematical zero, but never paused on the throughline connecting them to the physics and computing chapters near this book's end. The 9th-century Baghdad mathematician al-Khwarizmi, whose name gives us the word algorithm, wrote the treatise that gave the West the word algebra. Isaac Newton and Gottfried Leibniz independently developed calculus in the 17th century, arguing bitterly for the rest of their lives over who got there first. Alan Turing's 1936 paper on computable numbers, written before any computer existed to run on, defined what a computer could and could not do in principle — a piece of pure mathematics that this book's own digital chapter turns out to depend on entirely.</w:t>
       </w:r>
     </w:p>
     <w:p>
@@ -7649,6 +7637,21 @@
           <w:b/>
           <w:bCs/>
         </w:rPr>
+        <w:t xml:space="preserve">~10,000 BCE. </w:t>
+      </w:r>
+      <w:r>
+        <w:t xml:space="preserve">Agriculture begins in the Fertile Crescent; similar shifts follow independently in China, Mesoamerica, and New Guinea.</w:t>
+      </w:r>
+    </w:p>
+    <w:p>
+      <w:pPr>
+        <w:spacing w:after="200"/>
+      </w:pPr>
+      <w:r>
+        <w:rPr>
+          <w:b/>
+          <w:bCs/>
+        </w:rPr>
         <w:t xml:space="preserve">~9600 BCE. </w:t>
       </w:r>
       <w:r>
@@ -7664,22 +7667,7 @@
           <w:b/>
           <w:bCs/>
         </w:rPr>
-        <w:t xml:space="preserve">~10,000 BCE. </w:t>
-      </w:r>
-      <w:r>
-        <w:t xml:space="preserve">Agriculture begins in the Fertile Crescent; similar shifts follow independently in China, Mesoamerica, and New Guinea.</w:t>
-      </w:r>
-    </w:p>
-    <w:p>
-      <w:pPr>
-        <w:spacing w:after="200"/>
-      </w:pPr>
-      <w:r>
-        <w:rPr>
-          <w:b/>
-          <w:bCs/>
-        </w:rPr>
-        <w:t xml:space="preserve">~7,500 BCE. </w:t>
+        <w:t xml:space="preserve">~7500 BCE. </w:t>
       </w:r>
       <w:r>
         <w:t xml:space="preserve">Çatalhöyük, in Anatolia, houses several thousand people who enter their homes through the roof.</w:t>
@@ -7694,7 +7682,7 @@
           <w:b/>
           <w:bCs/>
         </w:rPr>
-        <w:t xml:space="preserve">~3,200 BCE. </w:t>
+        <w:t xml:space="preserve">~3200 BCE. </w:t>
       </w:r>
       <w:r>
         <w:t xml:space="preserve">Writing appears in Sumer as cuneiform; Egyptian hieroglyphs emerge at almost the same time.</w:t>
@@ -7939,6 +7927,21 @@
           <w:b/>
           <w:bCs/>
         </w:rPr>
+        <w:t xml:space="preserve">323 BCE. </w:t>
+      </w:r>
+      <w:r>
+        <w:t xml:space="preserve">Alexander the Great dies; his empire fractures into rival kingdoms within a generation.</w:t>
+      </w:r>
+    </w:p>
+    <w:p>
+      <w:pPr>
+        <w:spacing w:after="200"/>
+      </w:pPr>
+      <w:r>
+        <w:rPr>
+          <w:b/>
+          <w:bCs/>
+        </w:rPr>
         <w:t xml:space="preserve">321 BCE. </w:t>
       </w:r>
       <w:r>
@@ -7954,21 +7957,6 @@
           <w:b/>
           <w:bCs/>
         </w:rPr>
-        <w:t xml:space="preserve">323 BCE. </w:t>
-      </w:r>
-      <w:r>
-        <w:t xml:space="preserve">Alexander the Great dies; his empire fractures into rival kingdoms within a generation.</w:t>
-      </w:r>
-    </w:p>
-    <w:p>
-      <w:pPr>
-        <w:spacing w:after="200"/>
-      </w:pPr>
-      <w:r>
-        <w:rPr>
-          <w:b/>
-          <w:bCs/>
-        </w:rPr>
         <w:t xml:space="preserve">221 BCE. </w:t>
       </w:r>
       <w:r>
@@ -8119,10 +8107,10 @@
           <w:b/>
           <w:bCs/>
         </w:rPr>
-        <w:t xml:space="preserve">581 CE. </w:t>
-      </w:r>
-      <w:r>
-        <w:t xml:space="preserve">China's Sui dynasty reunifies the country and introduces the imperial civil service examination.</w:t>
+        <w:t xml:space="preserve">581-605 CE. </w:t>
+      </w:r>
+      <w:r>
+        <w:t xml:space="preserve">China's Sui dynasty takes power, reunifies the country in 589, and introduces the imperial civil service examination.</w:t>
       </w:r>
     </w:p>
     <w:p>
@@ -8967,7 +8955,7 @@
         <w:t xml:space="preserve">1918-1920. </w:t>
       </w:r>
       <w:r>
-        <w:t xml:space="preserve">An influenza pandemic, misnamed the Spanish flu, kills an estimated fifty million people.</w:t>
+        <w:t xml:space="preserve">An influenza pandemic, misnamed the Spanish flu, kills an estimated 17 to 50 million people, perhaps more.</w:t>
       </w:r>
     </w:p>
     <w:p>
@@ -8982,7 +8970,7 @@
         <w:t xml:space="preserve">1919. </w:t>
       </w:r>
       <w:r>
-        <w:t xml:space="preserve">The Treaty of Versailles is signed; Eddington's eclipse expedition confirms Einstein's relativity.</w:t>
+        <w:t xml:space="preserve">The Treaty of Versailles is signed; Eddington's eclipse expedition confirms Einstein's general relativity.</w:t>
       </w:r>
     </w:p>
     <w:p>
@@ -9287,7 +9275,7 @@
         <w:t xml:space="preserve">1965. </w:t>
       </w:r>
       <w:r>
-        <w:t xml:space="preserve">Gordon Moore observes that the number of transistors on a chip is doubling every two years, give or take.</w:t>
+        <w:t xml:space="preserve">Gordon Moore observes that the number of components on a chip is doubling every year; in 1975 he revises it to every two years.</w:t>
       </w:r>
     </w:p>
     <w:p>
@@ -9589,10 +9577,25 @@
           <w:b/>
           <w:bCs/>
         </w:rPr>
-        <w:t xml:space="preserve">2024. </w:t>
-      </w:r>
-      <w:r>
-        <w:t xml:space="preserve">A Chinese manufacturer, BYD, overtakes Tesla in global electric-vehicle sales.</w:t>
+        <w:t xml:space="preserve">2025. </w:t>
+      </w:r>
+      <w:r>
+        <w:t xml:space="preserve">A Chinese manufacturer, BYD, passes Tesla in full-year sales of battery-electric cars.</w:t>
+      </w:r>
+    </w:p>
+    <w:p>
+      <w:pPr>
+        <w:spacing w:after="200"/>
+      </w:pPr>
+      <w:r>
+        <w:rPr>
+          <w:b/>
+          <w:bCs/>
+        </w:rPr>
+        <w:t xml:space="preserve">2026. </w:t>
+      </w:r>
+      <w:r>
+        <w:t xml:space="preserve">Artemis II carries four astronauts around the Moon, farther from Earth than any humans before them.</w:t>
       </w:r>
     </w:p>
     <w:p>
@@ -9692,7 +9695,7 @@
         <w:t xml:space="preserve">2117 and 2125. </w:t>
       </w:r>
       <w:r>
-        <w:t xml:space="preserve">The next pair of transits of Venus across the face of the Sun — an alignment rare enough that the previous pair fell in 1874 and 1882, a gap of no personal interest to anyone who saw both.</w:t>
+        <w:t xml:space="preserve">The next pair of transits of Venus across the face of the Sun — an alignment rare enough that the previous pair fell in 2004 and 2012 and the pair before that in 1874 and 1882. Nobody who watched the last one is likely to see the next.</w:t>
       </w:r>
     </w:p>
     <w:p>
@@ -9724,24 +9727,24 @@
           <w:b/>
           <w:bCs/>
         </w:rPr>
-        <w:t xml:space="preserve">~10,000 years. </w:t>
-      </w:r>
-      <w:r>
-        <w:t xml:space="preserve">By the underlying orbital cycle, Earth would be about due for its next glacial period around now. Current research suggests human-driven warming has pushed that schedule back by several thousand years — one of the only entries in this book where a side effect and an intention are difficult to tell apart.</w:t>
-      </w:r>
-    </w:p>
-    <w:p>
-      <w:pPr>
-        <w:spacing w:after="200"/>
-      </w:pPr>
-      <w:r>
-        <w:rPr>
-          <w:b/>
-          <w:bCs/>
-        </w:rPr>
         <w:t xml:space="preserve">~50,000 years. </w:t>
       </w:r>
       <w:r>
+        <w:t xml:space="preserve">Earth's orbital cycle would, left alone, bring the next glacial period at about this point. Modeling published in 2016 suggests the carbon dioxide humans have already added could push it back by another fifty thousand years or more — one of the only entries in this book where a side effect and an intention are difficult to tell apart.</w:t>
+      </w:r>
+    </w:p>
+    <w:p>
+      <w:pPr>
+        <w:spacing w:after="200"/>
+      </w:pPr>
+      <w:r>
+        <w:rPr>
+          <w:b/>
+          <w:bCs/>
+        </w:rPr>
+        <w:t xml:space="preserve">~50,000 years. </w:t>
+      </w:r>
+      <w:r>
         <w:t xml:space="preserve">Niagara Falls, eroding upstream at its measured rate, reaches Lake Erie and stops being a waterfall, barring further engineering — which, on this book's evidence, is not a safe assumption to rule out.</w:t>
       </w:r>
     </w:p>
@@ -9769,25 +9772,25 @@
           <w:b/>
           <w:bCs/>
         </w:rPr>
-        <w:t xml:space="preserve">~4-5 billion years. </w:t>
-      </w:r>
-      <w:r>
-        <w:t xml:space="preserve">The Milky Way and the Andromeda galaxy, presently falling toward each other, are expected to collide and merge. The distances involved are large enough that not one single star, including whatever the Sun has become by then, is expected to actually strike another.</w:t>
-      </w:r>
-    </w:p>
-    <w:p>
-      <w:pPr>
-        <w:spacing w:after="200"/>
-      </w:pPr>
-      <w:r>
-        <w:rPr>
-          <w:b/>
-          <w:bCs/>
-        </w:rPr>
         <w:t xml:space="preserve">~5 billion years. </w:t>
       </w:r>
       <w:r>
         <w:t xml:space="preserve">The Sun exhausts its hydrogen fuel and swells into a red giant, very likely engulfing Mercury and Venus. Earth's own fate — swallowed, or merely scorched from a closer orbit than it currently holds — remains a genuinely open question among astronomers still refining the models.</w:t>
+      </w:r>
+    </w:p>
+    <w:p>
+      <w:pPr>
+        <w:spacing w:after="200"/>
+      </w:pPr>
+      <w:r>
+        <w:rPr>
+          <w:b/>
+          <w:bCs/>
+        </w:rPr>
+        <w:t xml:space="preserve">~5-10 billion years. </w:t>
+      </w:r>
+      <w:r>
+        <w:t xml:space="preserve">The Milky Way and the Andromeda galaxy, presently falling toward each other, may collide and merge; a 2025 re-analysis put the odds at roughly even within ten billion years. The distances involved are large enough that hardly a single star, including whatever the Sun has become by then, is expected to actually strike another.</w:t>
       </w:r>
     </w:p>
     <w:p>
@@ -10116,7 +10119,7 @@
         <w:t xml:space="preserve">The Hitchhiker's Guide to the Galaxy, by Douglas Adams (1979). </w:t>
       </w:r>
       <w:r>
-        <w:t xml:space="preserve">For the other dolphins, and for the general approach to explaining everything. The dolphins appear in the fourth book of the series, So Long, and Thanks for All the Fish (1984). The dolphins here wish it noted that they are not the same dolphins.</w:t>
+        <w:t xml:space="preserve">For the other dolphins, and for the general approach to explaining everything. The dolphins' farewell gives the fourth book of the series its title, So Long, and Thanks for All the Fish (1984). The dolphins here wish it noted that they are not the same dolphins.</w:t>
       </w:r>
     </w:p>
     <w:sectPr>

</xml_diff>